<commit_message>
Remove `heal_json.py` script and update `assignments.json`.
</commit_message>
<xml_diff>
--- a/assignment/outputs/docx/G1/شيماء طارق/M4_2026-03-11 18_20.docx
+++ b/assignment/outputs/docx/G1/شيماء طارق/M4_2026-03-11 18_20.docx
@@ -73,7 +73,7 @@
           <w:rFonts w:ascii="Simplified Arabic" w:hAnsi="Simplified Arabic"/>
           <w:sz w:val="28"/>
         </w:rPr>
-        <w:t>بالنسبة للتحسينات الأخلاقية، أصبحت أفكر أكثر في الآثار الاجتماعية والبيئية لمشاريع ريادة الأعمال. هذا جعلني أكثر حذراً وأكثر مسؤولية عند اختيار المشاريع التي أشارك فيها.</w:t>
+        <w:t>بالنسبة للتحسينات الأخلاقية، أصبحت أفكر أكثر في المسؤولية الاجتماعية للشركات وتأثيرها على المجتمع. أدركت أهمية الأخلاقيات والقيم في ريادة الأعمال، وأصبحت أعمل على تطوير منتجات وأفكار تعكس قيمتي الأخلاقية وأساهم في تحسين المجتمع من خلالها.</w:t>
       </w:r>
     </w:p>
     <w:p>
@@ -85,7 +85,7 @@
           <w:rFonts w:ascii="Simplified Arabic" w:hAnsi="Simplified Arabic"/>
           <w:sz w:val="28"/>
         </w:rPr>
-        <w:t>كل هذه التحسينات أشعر أنني أصبحت أكثر وعيًا ومدروسة في تفكيري وعملي. استمراري في البحث والتدقيق الدقيق ساهم بشكل كبير في تطوير قدراتي.</w:t>
+        <w:t>بشكل عام، استفدت كثيرًا من هذه المهام، وأصبحت أكثر قدرة على التحليل النقدي واستخدام الأمثلة الواقعية وفهم النصوص الأدبية بشكل أفضل. وأصبحت أفكر بشكل أكثر أخلاقية وأعمق في مشاريع ريادة الأعمال.</w:t>
       </w:r>
     </w:p>
     <w:sectPr>

</xml_diff>